<commit_message>
Use hyphens instead of em dashes; add Binboro QA duties; fix bullet markers
</commit_message>
<xml_diff>
--- a/Claude outputs/Maria_Shalverchuk_CV.docx
+++ b/Claude outputs/Maria_Shalverchuk_CV.docx
@@ -49,7 +49,7 @@
         </w:rPr>
         <w:t xml:space="preserve">Prague, Czech Republic  ·  +420 775 156 194  ·  </w:t>
       </w:r>
-      <w:hyperlink w:history="1" r:id="rIdbnue-l2gb0jdh0nbncofw">
+      <w:hyperlink w:history="1" r:id="rIdj2wssicjlrerdumomv-fw">
         <w:r>
           <w:rPr>
             <w:rFonts w:ascii="Calibri" w:cs="Calibri" w:eastAsia="Calibri" w:hAnsi="Calibri"/>
@@ -71,7 +71,7 @@
         </w:rPr>
         <w:t xml:space="preserve">  ·  </w:t>
       </w:r>
-      <w:hyperlink w:history="1" r:id="rIdzqa6398tftmmxcpthrdlz">
+      <w:hyperlink w:history="1" r:id="rIdbdnetilhqmp_2bhiav5z5">
         <w:r>
           <w:rPr>
             <w:rFonts w:ascii="Calibri" w:cs="Calibri" w:eastAsia="Calibri" w:hAnsi="Calibri"/>
@@ -164,7 +164,7 @@
           <w:sz w:val="21"/>
           <w:szCs w:val="21"/>
         </w:rPr>
-        <w:t xml:space="preserve"> as the assigned tester since 2023 — 995 features, 926 bugs and 133 tech-debt items across 50 product modules; 775 in 2025 alone (~3 per working day), 533 of them at Urgent or Immediate priority.</w:t>
+        <w:t xml:space="preserve"> as the assigned tester since 2023 - 995 features, 926 bugs and 133 tech-debt items across 50 product modules; 775 in 2025 alone (~3 per working day), 533 of them at Urgent or Immediate priority.</w:t>
       </w:r>
     </w:p>
     <w:p>
@@ -224,7 +224,7 @@
           <w:sz w:val="21"/>
           <w:szCs w:val="21"/>
         </w:rPr>
-        <w:t xml:space="preserve"> and grew it from zero into the platform's regression safety net — guest self check-in (Alfred PWA), booking-engine link/code generator, hotel administration (documents, licences, monthly fees, reports), guest database, invoicing, pricing and SSO/device-ID login.</w:t>
+        <w:t xml:space="preserve"> and grew it from zero into the platform's regression safety net - guest self check-in (Alfred PWA), booking-engine link/code generator, hotel administration (documents, licences, monthly fees, reports), guest database, invoicing, pricing and SSO/device-ID login.</w:t>
       </w:r>
     </w:p>
     <w:p>
@@ -314,7 +314,7 @@
           <w:sz w:val="21"/>
           <w:szCs w:val="21"/>
         </w:rPr>
-        <w:t xml:space="preserve"> — hiring interviews, onboarding, mentoring and QA documentation standards; organised internal JavaScript upskilling for the department.</w:t>
+        <w:t xml:space="preserve"> - hiring interviews, onboarding, mentoring and QA documentation standards; organised internal JavaScript upskilling for the department.</w:t>
       </w:r>
     </w:p>
     <w:p>
@@ -368,7 +368,7 @@
           <w:sz w:val="20"/>
           <w:szCs w:val="20"/>
         </w:rPr>
-        <w:t xml:space="preserve">   Feb 2025 – Present</w:t>
+        <w:t xml:space="preserve">   Feb 2025 - Present</w:t>
       </w:r>
     </w:p>
     <w:p>
@@ -404,7 +404,7 @@
           <w:sz w:val="21"/>
           <w:szCs w:val="21"/>
         </w:rPr>
-        <w:t xml:space="preserve">Own the continuous-delivery roadmap for P2 — Redmine status flow, versions and releases, and the dashboard used to track delivery progress.</w:t>
+        <w:t xml:space="preserve">Own the continuous-delivery roadmap for P2 - Redmine status flow, versions and releases, and the dashboard used to track delivery progress.</w:t>
       </w:r>
     </w:p>
     <w:p>
@@ -474,7 +474,7 @@
           <w:sz w:val="20"/>
           <w:szCs w:val="20"/>
         </w:rPr>
-        <w:t xml:space="preserve">   Mar 2023 – Present</w:t>
+        <w:t xml:space="preserve">   Mar 2023 - Present</w:t>
       </w:r>
     </w:p>
     <w:p>
@@ -582,7 +582,7 @@
           <w:sz w:val="21"/>
           <w:szCs w:val="21"/>
         </w:rPr>
-        <w:t xml:space="preserve">Lead QA for fiscal and legal compliance across markets — VAT logic, visitor and local taxes, country-specific reporting and invoicing rules (CZ, SK, PL, RO, HU).</w:t>
+        <w:t xml:space="preserve">Lead QA for fiscal and legal compliance across markets - VAT logic, visitor and local taxes, country-specific reporting and invoicing rules (CZ, SK, PL, RO, HU).</w:t>
       </w:r>
     </w:p>
     <w:p>
@@ -670,7 +670,7 @@
           <w:sz w:val="20"/>
           <w:szCs w:val="20"/>
         </w:rPr>
-        <w:t xml:space="preserve">   Sep 2020 – Mar 2023</w:t>
+        <w:t xml:space="preserve">   Sep 2020 - Mar 2023</w:t>
       </w:r>
     </w:p>
     <w:p>
@@ -776,25 +776,25 @@
           <w:sz w:val="20"/>
           <w:szCs w:val="20"/>
         </w:rPr>
-        <w:t xml:space="preserve">   Dec 2015 – Jan 2018</w:t>
-      </w:r>
-    </w:p>
-    <w:p>
-      <w:pPr>
-        <w:pStyle w:val="ListParagraph"/>
-        <w:numPr>
-          <w:ilvl w:val="0"/>
-          <w:numId w:val="2"/>
-        </w:numPr>
-        <w:spacing w:after="40"/>
-      </w:pPr>
-      <w:r>
-        <w:rPr>
-          <w:rFonts w:ascii="Calibri" w:cs="Calibri" w:eastAsia="Calibri" w:hAnsi="Calibri"/>
-          <w:sz w:val="21"/>
-          <w:szCs w:val="21"/>
-        </w:rPr>
-        <w:t xml:space="preserve">Tested the client websites the studio built — layout and responsive behaviour across browsers and devices, navigation, forms and content — before every hand-over.</w:t>
+        <w:t xml:space="preserve">   Dec 2015 - Jan 2018</w:t>
+      </w:r>
+    </w:p>
+    <w:p>
+      <w:pPr>
+        <w:pStyle w:val="ListParagraph"/>
+        <w:numPr>
+          <w:ilvl w:val="0"/>
+          <w:numId w:val="2"/>
+        </w:numPr>
+        <w:spacing w:after="40"/>
+      </w:pPr>
+      <w:r>
+        <w:rPr>
+          <w:rFonts w:ascii="Calibri" w:cs="Calibri" w:eastAsia="Calibri" w:hAnsi="Calibri"/>
+          <w:sz w:val="21"/>
+          <w:szCs w:val="21"/>
+        </w:rPr>
+        <w:t xml:space="preserve">Tested the client websites the studio built - layout and responsive behaviour across browsers and devices, navigation, forms and content - before every hand-over.</w:t>
       </w:r>
     </w:p>
     <w:p>
@@ -882,7 +882,7 @@
           <w:sz w:val="20"/>
           <w:szCs w:val="20"/>
         </w:rPr>
-        <w:t xml:space="preserve">   Mar 2015 – Dec 2015</w:t>
+        <w:t xml:space="preserve">   Mar 2015 - Dec 2015</w:t>
       </w:r>
     </w:p>
     <w:p>
@@ -952,7 +952,7 @@
           <w:sz w:val="20"/>
           <w:szCs w:val="20"/>
         </w:rPr>
-        <w:t xml:space="preserve">   Dec 2014 – Feb 2015</w:t>
+        <w:t xml:space="preserve">   Dec 2014 - Feb 2015</w:t>
       </w:r>
     </w:p>
     <w:p>
@@ -1160,7 +1160,7 @@
           <w:sz w:val="21"/>
           <w:szCs w:val="21"/>
         </w:rPr>
-        <w:t xml:space="preserve">M.Sc., Logistics Systems Engineering, 2011–2015</w:t>
+        <w:t xml:space="preserve">M.Sc., Logistics Systems Engineering, 2011-2015</w:t>
       </w:r>
     </w:p>
     <w:p>
@@ -1185,7 +1185,7 @@
           <w:sz w:val="21"/>
           <w:szCs w:val="21"/>
         </w:rPr>
-        <w:t xml:space="preserve">Transport Organisation and Management, 2007–2011</w:t>
+        <w:t xml:space="preserve">Transport Organisation and Management, 2007-2011</w:t>
       </w:r>
     </w:p>
     <w:p>
@@ -1201,7 +1201,7 @@
           <w:sz w:val="20"/>
           <w:szCs w:val="20"/>
         </w:rPr>
-        <w:t xml:space="preserve">Czech recognition of the master's degree (nostrification) granted by the Czech Technical University in Prague (ČVUT), August 2026 — recognised as equivalent to a Czech public-university master's programme.</w:t>
+        <w:t xml:space="preserve">Czech recognition of the master's degree (nostrification) granted by the Czech Technical University in Prague (ČVUT), August 2026 - recognised as equivalent to a Czech public-university master's programme.</w:t>
       </w:r>
     </w:p>
     <w:p>
@@ -1239,61 +1239,61 @@
           <w:sz w:val="21"/>
           <w:szCs w:val="21"/>
         </w:rPr>
-        <w:t xml:space="preserve">JavaScript (2024) and Leadership (2024) — ICT Pro</w:t>
-      </w:r>
-    </w:p>
-    <w:p>
-      <w:pPr>
-        <w:pStyle w:val="ListParagraph"/>
-        <w:numPr>
-          <w:ilvl w:val="0"/>
-          <w:numId w:val="2"/>
-        </w:numPr>
-        <w:spacing w:after="40"/>
-      </w:pPr>
-      <w:r>
-        <w:rPr>
-          <w:rFonts w:ascii="Calibri" w:cs="Calibri" w:eastAsia="Calibri" w:hAnsi="Calibri"/>
-          <w:sz w:val="21"/>
-          <w:szCs w:val="21"/>
-        </w:rPr>
-        <w:t xml:space="preserve">Czech language certificate for foreigners — Charles University (2023); Project Management — ICT Pro (2023)</w:t>
-      </w:r>
-    </w:p>
-    <w:p>
-      <w:pPr>
-        <w:pStyle w:val="ListParagraph"/>
-        <w:numPr>
-          <w:ilvl w:val="0"/>
-          <w:numId w:val="2"/>
-        </w:numPr>
-        <w:spacing w:after="40"/>
-      </w:pPr>
-      <w:r>
-        <w:rPr>
-          <w:rFonts w:ascii="Calibri" w:cs="Calibri" w:eastAsia="Calibri" w:hAnsi="Calibri"/>
-          <w:sz w:val="21"/>
-          <w:szCs w:val="21"/>
-        </w:rPr>
-        <w:t xml:space="preserve">Software Testing — SkillUp (2021); ISTQB Foundation and JMeter — Pluralsight</w:t>
-      </w:r>
-    </w:p>
-    <w:p>
-      <w:pPr>
-        <w:pStyle w:val="ListParagraph"/>
-        <w:numPr>
-          <w:ilvl w:val="0"/>
-          <w:numId w:val="2"/>
-        </w:numPr>
-        <w:spacing w:after="40"/>
-      </w:pPr>
-      <w:r>
-        <w:rPr>
-          <w:rFonts w:ascii="Calibri" w:cs="Calibri" w:eastAsia="Calibri" w:hAnsi="Calibri"/>
-          <w:sz w:val="21"/>
-          <w:szCs w:val="21"/>
-        </w:rPr>
-        <w:t xml:space="preserve">Cypress — FrontendMasters "Testing Web Apps with Cypress"; Pluralsight "Cypress End-to-end JavaScript Testing", "Cypress 9 Fundamentals", "End-to-end Vue Testing with Cypress"</w:t>
+        <w:t xml:space="preserve">JavaScript (2024) and Leadership (2024) - ICT Pro</w:t>
+      </w:r>
+    </w:p>
+    <w:p>
+      <w:pPr>
+        <w:pStyle w:val="ListParagraph"/>
+        <w:numPr>
+          <w:ilvl w:val="0"/>
+          <w:numId w:val="2"/>
+        </w:numPr>
+        <w:spacing w:after="40"/>
+      </w:pPr>
+      <w:r>
+        <w:rPr>
+          <w:rFonts w:ascii="Calibri" w:cs="Calibri" w:eastAsia="Calibri" w:hAnsi="Calibri"/>
+          <w:sz w:val="21"/>
+          <w:szCs w:val="21"/>
+        </w:rPr>
+        <w:t xml:space="preserve">Czech language certificate for foreigners - Charles University (2023); Project Management - ICT Pro (2023)</w:t>
+      </w:r>
+    </w:p>
+    <w:p>
+      <w:pPr>
+        <w:pStyle w:val="ListParagraph"/>
+        <w:numPr>
+          <w:ilvl w:val="0"/>
+          <w:numId w:val="2"/>
+        </w:numPr>
+        <w:spacing w:after="40"/>
+      </w:pPr>
+      <w:r>
+        <w:rPr>
+          <w:rFonts w:ascii="Calibri" w:cs="Calibri" w:eastAsia="Calibri" w:hAnsi="Calibri"/>
+          <w:sz w:val="21"/>
+          <w:szCs w:val="21"/>
+        </w:rPr>
+        <w:t xml:space="preserve">Software Testing - SkillUp (2021); ISTQB Foundation and JMeter - Pluralsight</w:t>
+      </w:r>
+    </w:p>
+    <w:p>
+      <w:pPr>
+        <w:pStyle w:val="ListParagraph"/>
+        <w:numPr>
+          <w:ilvl w:val="0"/>
+          <w:numId w:val="2"/>
+        </w:numPr>
+        <w:spacing w:after="40"/>
+      </w:pPr>
+      <w:r>
+        <w:rPr>
+          <w:rFonts w:ascii="Calibri" w:cs="Calibri" w:eastAsia="Calibri" w:hAnsi="Calibri"/>
+          <w:sz w:val="21"/>
+          <w:szCs w:val="21"/>
+        </w:rPr>
+        <w:t xml:space="preserve">Cypress - FrontendMasters "Testing Web Apps with Cypress"; Pluralsight "Cypress End-to-end JavaScript Testing", "Cypress 9 Fundamentals", "End-to-end Vue Testing with Cypress"</w:t>
       </w:r>
     </w:p>
     <w:p>
@@ -1364,43 +1364,43 @@
           <w:sz w:val="21"/>
           <w:szCs w:val="21"/>
         </w:rPr>
-        <w:t xml:space="preserve">People in Need — member of the Friends Club, since 2021</w:t>
-      </w:r>
-    </w:p>
-    <w:p>
-      <w:pPr>
-        <w:pStyle w:val="ListParagraph"/>
-        <w:numPr>
-          <w:ilvl w:val="0"/>
-          <w:numId w:val="2"/>
-        </w:numPr>
-        <w:spacing w:after="40"/>
-      </w:pPr>
-      <w:r>
-        <w:rPr>
-          <w:rFonts w:ascii="Calibri" w:cs="Calibri" w:eastAsia="Calibri" w:hAnsi="Calibri"/>
-          <w:sz w:val="21"/>
-          <w:szCs w:val="21"/>
-        </w:rPr>
-        <w:t xml:space="preserve">Prague Congress Centre — translator for Ukrainian refugees (EN / CZ / UA / RU), Feb–Apr 2022</w:t>
-      </w:r>
-    </w:p>
-    <w:p>
-      <w:pPr>
-        <w:pStyle w:val="ListParagraph"/>
-        <w:numPr>
-          <w:ilvl w:val="0"/>
-          <w:numId w:val="2"/>
-        </w:numPr>
-        <w:spacing w:after="40"/>
-      </w:pPr>
-      <w:r>
-        <w:rPr>
-          <w:rFonts w:ascii="Calibri" w:cs="Calibri" w:eastAsia="Calibri" w:hAnsi="Calibri"/>
-          <w:sz w:val="21"/>
-          <w:szCs w:val="21"/>
-        </w:rPr>
-        <w:t xml:space="preserve">Women for Women International — school-meals programme, since 2023</w:t>
+        <w:t xml:space="preserve">People in Need - member of the Friends Club, since 2021</w:t>
+      </w:r>
+    </w:p>
+    <w:p>
+      <w:pPr>
+        <w:pStyle w:val="ListParagraph"/>
+        <w:numPr>
+          <w:ilvl w:val="0"/>
+          <w:numId w:val="2"/>
+        </w:numPr>
+        <w:spacing w:after="40"/>
+      </w:pPr>
+      <w:r>
+        <w:rPr>
+          <w:rFonts w:ascii="Calibri" w:cs="Calibri" w:eastAsia="Calibri" w:hAnsi="Calibri"/>
+          <w:sz w:val="21"/>
+          <w:szCs w:val="21"/>
+        </w:rPr>
+        <w:t xml:space="preserve">Prague Congress Centre - translator for Ukrainian refugees (EN / CZ / UA / RU), Feb-Apr 2022</w:t>
+      </w:r>
+    </w:p>
+    <w:p>
+      <w:pPr>
+        <w:pStyle w:val="ListParagraph"/>
+        <w:numPr>
+          <w:ilvl w:val="0"/>
+          <w:numId w:val="2"/>
+        </w:numPr>
+        <w:spacing w:after="40"/>
+      </w:pPr>
+      <w:r>
+        <w:rPr>
+          <w:rFonts w:ascii="Calibri" w:cs="Calibri" w:eastAsia="Calibri" w:hAnsi="Calibri"/>
+          <w:sz w:val="21"/>
+          <w:szCs w:val="21"/>
+        </w:rPr>
+        <w:t xml:space="preserve">Women for Women International - school-meals programme, since 2023</w:t>
       </w:r>
     </w:p>
     <w:sectPr>

</xml_diff>

<commit_message>
Remove Russian from languages
</commit_message>
<xml_diff>
--- a/Claude outputs/Maria_Shalverchuk_CV.docx
+++ b/Claude outputs/Maria_Shalverchuk_CV.docx
@@ -49,7 +49,7 @@
         </w:rPr>
         <w:t xml:space="preserve">Prague, Czech Republic  ·  +420 775 156 194  ·  </w:t>
       </w:r>
-      <w:hyperlink w:history="1" r:id="rIdj2wssicjlrerdumomv-fw">
+      <w:hyperlink w:history="1" r:id="rIdiw8oikmcgjcg_jdotwgvb">
         <w:r>
           <w:rPr>
             <w:rFonts w:ascii="Calibri" w:cs="Calibri" w:eastAsia="Calibri" w:hAnsi="Calibri"/>
@@ -71,7 +71,7 @@
         </w:rPr>
         <w:t xml:space="preserve">  ·  </w:t>
       </w:r>
-      <w:hyperlink w:history="1" r:id="rIdbdnetilhqmp_2bhiav5z5">
+      <w:hyperlink w:history="1" r:id="rIddhy58exuvp0iola7unff_">
         <w:r>
           <w:rPr>
             <w:rFonts w:ascii="Calibri" w:cs="Calibri" w:eastAsia="Calibri" w:hAnsi="Calibri"/>
@@ -254,7 +254,7 @@
           <w:sz w:val="21"/>
           <w:szCs w:val="21"/>
         </w:rPr>
-        <w:t xml:space="preserve">: release roadmap, Redmine status workflow, versioning and release management, progress dashboard, and test planning across VHost / Staging / Production.</w:t>
+        <w:t xml:space="preserve">: release roadmap, Redmine status workflow, versioning and release management, progress dashboard, and test planning across VHost / Dev / Staging / Production / Demo.</w:t>
       </w:r>
     </w:p>
     <w:p>
@@ -422,7 +422,7 @@
           <w:sz w:val="21"/>
           <w:szCs w:val="21"/>
         </w:rPr>
-        <w:t xml:space="preserve">Plan what is tested on which environment (VHost, Staging, Production) and gate releases on that coverage.</w:t>
+        <w:t xml:space="preserve">Plan what is tested on which environment (VHost, Dev, Staging, Production, Demo) and gate releases on that coverage.</w:t>
       </w:r>
     </w:p>
     <w:p>
@@ -1326,7 +1326,7 @@
           <w:sz w:val="21"/>
           <w:szCs w:val="21"/>
         </w:rPr>
-        <w:t xml:space="preserve">Ukrainian (native)  ·  Czech (professional)  ·  English (professional)  ·  Russian (professional)  ·  German (basic)  ·  Spanish (basic)</w:t>
+        <w:t xml:space="preserve">Ukrainian (native)  ·  Czech (professional)  ·  English (professional)  ·  German (basic)  ·  Spanish (basic)</w:t>
       </w:r>
     </w:p>
     <w:p>
@@ -1382,7 +1382,7 @@
           <w:sz w:val="21"/>
           <w:szCs w:val="21"/>
         </w:rPr>
-        <w:t xml:space="preserve">Prague Congress Centre - translator for Ukrainian refugees (EN / CZ / UA / RU), Feb-Apr 2022</w:t>
+        <w:t xml:space="preserve">Prague Congress Centre - translator for Ukrainian refugees (EN / CZ / UA), Feb-Apr 2022</w:t>
       </w:r>
     </w:p>
     <w:p>

</xml_diff>